<commit_message>
Add DBS6 audit review (run 20260924-981b2555); flag new-campaign raises in DBS4
Review of the Decolure Bamboo Sheets 6 Piece ranking run and its stored review,
with swaps judged on the inventory planner and the run's dated arrivals, the
Queen hero split limited to the campaigns the push raises, and each rank freeze
read on the daily crawl. In DBS4, raises on campaigns missing from the export
are now flagged rather than held, since Command Center shows them as new
launches.

Co-Authored-By: Claude Opus 5.5 <noreply@anthropic.com>
Claude-Session: https://claude.ai/code/session_01ECNUyLvUafHehET6NevFNz
</commit_message>
<xml_diff>
--- a/docs/reviews/DBS4_Audit_Review_20260924-5e8a0f10.docx
+++ b/docs/reviews/DBS4_Audit_Review_20260924-5e8a0f10.docx
@@ -96,7 +96,7 @@
         <w:rPr>
           <w:rFonts w:ascii="Calibri" w:cs="Calibri" w:eastAsia="Calibri" w:hAnsi="Calibri"/>
         </w:rPr>
-        <w:t xml:space="preserve">Eighteen writes land on paused campaigns, and 13 raises land on campaigns the export does not carry, including a budget from $5.37 to $12.11 a day and six bids +25%. The stored review passed all of them.</w:t>
+        <w:t xml:space="preserve">Eighteen writes land on paused campaigns; the stored review passed them all. Thirteen raises land on campaigns missing from the export’s campaign list, including a budget from $5.37 to $12.11 a day and six bids +25%. Command Center shows these are new campaigns that have barely served ($31 in 14 days), so the raises stand, flagged.</w:t>
       </w:r>
     </w:p>
     <w:p>
@@ -400,7 +400,7 @@
                 <w:sz w:val="16"/>
                 <w:szCs w:val="16"/>
               </w:rPr>
-              <w:t xml:space="preserve">39</w:t>
+              <w:t xml:space="preserve">26</w:t>
             </w:r>
           </w:p>
         </w:tc>
@@ -468,7 +468,7 @@
                 <w:sz w:val="16"/>
                 <w:szCs w:val="16"/>
               </w:rPr>
-              <w:t xml:space="preserve">12</w:t>
+              <w:t xml:space="preserve">25</w:t>
             </w:r>
           </w:p>
         </w:tc>
@@ -755,7 +755,7 @@
         <w:rPr>
           <w:rFonts w:ascii="Calibri" w:cs="Calibri" w:eastAsia="Calibri" w:hAnsi="Calibri"/>
         </w:rPr>
-        <w:t xml:space="preserve">Outcome: the run books spend $923 → $1,210 a day ($287.22), +298 top-of-search clicks and +39.8 orders a week, and TACoS 17.95% → 21.72%. The stored review already noted that the four engine raises and six retags are priced on thin reads, so the after-spend is overstated. With the rows held here removed, the run’s own arithmetic gives $121.76 a day, +180 clicks and +25.0 orders a week. At 21.7% TACoS the product would read 1.21× the band ceiling, the ELEVATED boundary, so the push should be read weekly against it (SOP-26 F2).</w:t>
+        <w:t xml:space="preserve">Outcome: the run books spend $923 → $1,210 a day ($287.22), +298 top-of-search clicks and +39.8 orders a week, and TACoS 17.95% → 21.72%. The stored review already noted that the four engine raises and six retags are priced on thin reads, so the after-spend is overstated. With the rows held here removed, the run’s own arithmetic gives $194.40 a day, +270 clicks and +37.5 orders a week. At 21.7% TACoS the product would read 1.21× the band ceiling, the ELEVATED boundary, so the push should be read weekly against it (SOP-26 F2).</w:t>
       </w:r>
     </w:p>
     <w:p>
@@ -830,7 +830,7 @@
         <w:rPr>
           <w:rFonts w:ascii="Calibri" w:cs="Calibri" w:eastAsia="Calibri" w:hAnsi="Calibri"/>
         </w:rPr>
-        <w:t xml:space="preserve">Confirm the campaigns missing from the export before any raise on them loads.</w:t>
+        <w:t xml:space="preserve">Add the new Cooling and Twin campaigns to the export’s campaign list so the next review can recompute their rows.</w:t>
       </w:r>
     </w:p>
     <w:p>
@@ -5088,7 +5088,7 @@
                 <w:sz w:val="16"/>
                 <w:szCs w:val="16"/>
               </w:rPr>
-              <w:t xml:space="preserve">614</w:t>
+              <w:t xml:space="preserve">610</w:t>
             </w:r>
           </w:p>
         </w:tc>
@@ -5181,7 +5181,7 @@
                 <w:sz w:val="16"/>
                 <w:szCs w:val="16"/>
               </w:rPr>
-              <w:t xml:space="preserve">53</w:t>
+              <w:t xml:space="preserve">52</w:t>
             </w:r>
           </w:p>
         </w:tc>
@@ -8568,7 +8568,7 @@
                 <w:sz w:val="16"/>
                 <w:szCs w:val="16"/>
               </w:rPr>
-              <w:t xml:space="preserve">101</w:t>
+              <w:t xml:space="preserve">100</w:t>
             </w:r>
           </w:p>
         </w:tc>
@@ -8661,7 +8661,7 @@
                 <w:sz w:val="16"/>
                 <w:szCs w:val="16"/>
               </w:rPr>
-              <w:t xml:space="preserve">86</w:t>
+              <w:t xml:space="preserve">85</w:t>
             </w:r>
           </w:p>
         </w:tc>
@@ -14392,7 +14392,7 @@
                 <w:sz w:val="16"/>
                 <w:szCs w:val="16"/>
               </w:rPr>
-              <w:t xml:space="preserve">BAMBOO-CALIFKING-OLIVE · 76 FBA +30 inb · 0.50/d · 166d</w:t>
+              <w:t xml:space="preserve">BAMBOO-CALIFKING-OLIVE · 70 FBA +30 inb · 0.50/d · 166d</w:t>
             </w:r>
           </w:p>
         </w:tc>
@@ -14422,7 +14422,7 @@
                 <w:sz w:val="16"/>
                 <w:szCs w:val="16"/>
               </w:rPr>
-              <w:t xml:space="preserve">66</w:t>
+              <w:t xml:space="preserve">61</w:t>
             </w:r>
           </w:p>
         </w:tc>
@@ -16639,7 +16639,7 @@
                 <w:sz w:val="16"/>
                 <w:szCs w:val="16"/>
               </w:rPr>
-              <w:t xml:space="preserve">Re-point by hand to BAMBOO-FULL-OLIVE: 101 in FBA, 3 reserved, 1.22/day, 86 days left.</w:t>
+              <w:t xml:space="preserve">Re-point by hand to BAMBOO-FULL-OLIVE: 100 in FBA, 3 reserved, 1.22/day, 85 days left.</w:t>
             </w:r>
           </w:p>
         </w:tc>
@@ -16956,7 +16956,7 @@
                 <w:sz w:val="16"/>
                 <w:szCs w:val="16"/>
               </w:rPr>
-              <w:t xml:space="preserve">Re-point by hand to BAMBOO-CALIFKING-TAUPE: 49 in FBA, 2 reserved, 60 inbound, 2.07/day, 25 days left.</w:t>
+              <w:t xml:space="preserve">Re-point by hand to BAMBOO-CALIFKING-TAUPE: 50 in FBA, 1 reserved, 60 inbound, 2.07/day, 25 days left.</w:t>
             </w:r>
           </w:p>
         </w:tc>
@@ -19165,7 +19165,7 @@
         <w:rPr>
           <w:rFonts w:ascii="Calibri" w:cs="Calibri" w:eastAsia="Calibri" w:hAnsi="Calibri"/>
         </w:rPr>
-        <w:t xml:space="preserve">C11. Raises on campaigns the export does not carry (13 held, 5 flagged)</w:t>
+        <w:t xml:space="preserve">C11. Raises on campaigns the export does not carry (18 rows, flagged)</w:t>
       </w:r>
     </w:p>
     <w:p>
@@ -19176,7 +19176,7 @@
         <w:rPr>
           <w:rFonts w:ascii="Calibri" w:cs="Calibri" w:eastAsia="Calibri" w:hAnsi="Calibri"/>
         </w:rPr>
-        <w:t xml:space="preserve">Six Cooling campaigns are not in the export’s campaign list. On them the run writes bids +25% (seq 2162–2167), top-of-search modifiers +7–9% (seq 2328–2338), and a budget from $5.37 to $12.11 a day (seq 2169), all passed by the stored review. With no status, child or read in the export, no reviewer can check them. The raises are held until the campaigns are confirmed; the five cuts stand, flagged.</w:t>
+        <w:t xml:space="preserve">Eleven campaigns, most of them new Cooling and Twin exacts, are not in the export’s campaign list. On them the run raises bids 25% (seq 2162–2167), top-of-search modifiers 7–9% (seq 2328–2338) and one budget from $5.37 to $12.11 a day (seq 2169), and cuts five others. The stored review passed all of them. Command Center carries the campaigns as new launches that have barely served: $31 and 2 orders in 14 days between them. Raising a new ranking campaign until it serves is legal inside the band, so the rows stand, flagged. The export should carry them next time.</w:t>
       </w:r>
     </w:p>
     <w:p>
@@ -19729,7 +19729,7 @@
                 <w:sz w:val="16"/>
                 <w:szCs w:val="16"/>
               </w:rPr>
-              <w:t xml:space="preserve">10</w:t>
+              <w:t xml:space="preserve">4</w:t>
             </w:r>
           </w:p>
         </w:tc>
@@ -19759,7 +19759,7 @@
                 <w:sz w:val="16"/>
                 <w:szCs w:val="16"/>
               </w:rPr>
-              <w:t xml:space="preserve">5</w:t>
+              <w:t xml:space="preserve">11</w:t>
             </w:r>
           </w:p>
         </w:tc>
@@ -19919,7 +19919,7 @@
                 <w:sz w:val="16"/>
                 <w:szCs w:val="16"/>
               </w:rPr>
-              <w:t xml:space="preserve">21</w:t>
+              <w:t xml:space="preserve">15</w:t>
             </w:r>
           </w:p>
         </w:tc>
@@ -19950,7 +19950,7 @@
                 <w:sz w:val="16"/>
                 <w:szCs w:val="16"/>
               </w:rPr>
-              <w:t xml:space="preserve">1</w:t>
+              <w:t xml:space="preserve">7</w:t>
             </w:r>
           </w:p>
         </w:tc>
@@ -20107,37 +20107,37 @@
                 <w:sz w:val="16"/>
                 <w:szCs w:val="16"/>
               </w:rPr>
+              <w:t xml:space="preserve">0</w:t>
+            </w:r>
+          </w:p>
+        </w:tc>
+        <w:tc>
+          <w:tcPr>
+            <w:tcW w:type="dxa" w:w="1700"/>
+            <w:tcBorders>
+              <w:top w:val="single" w:color="BFC7D1" w:sz="4"/>
+              <w:left w:val="single" w:color="BFC7D1" w:sz="4"/>
+              <w:bottom w:val="single" w:color="BFC7D1" w:sz="4"/>
+              <w:right w:val="single" w:color="BFC7D1" w:sz="4"/>
+            </w:tcBorders>
+            <w:tcMar>
+              <w:top w:type="dxa" w:w="40"/>
+              <w:left w:type="dxa" w:w="70"/>
+              <w:bottom w:type="dxa" w:w="40"/>
+              <w:right w:type="dxa" w:w="70"/>
+            </w:tcMar>
+          </w:tcPr>
+          <w:p>
+            <w:pPr>
+              <w:spacing w:after="0" w:line="240"/>
+            </w:pPr>
+            <w:r>
+              <w:rPr>
+                <w:rFonts w:ascii="Calibri" w:cs="Calibri" w:eastAsia="Calibri" w:hAnsi="Calibri"/>
+                <w:sz w:val="16"/>
+                <w:szCs w:val="16"/>
+              </w:rPr>
               <w:t xml:space="preserve">1</w:t>
-            </w:r>
-          </w:p>
-        </w:tc>
-        <w:tc>
-          <w:tcPr>
-            <w:tcW w:type="dxa" w:w="1700"/>
-            <w:tcBorders>
-              <w:top w:val="single" w:color="BFC7D1" w:sz="4"/>
-              <w:left w:val="single" w:color="BFC7D1" w:sz="4"/>
-              <w:bottom w:val="single" w:color="BFC7D1" w:sz="4"/>
-              <w:right w:val="single" w:color="BFC7D1" w:sz="4"/>
-            </w:tcBorders>
-            <w:tcMar>
-              <w:top w:type="dxa" w:w="40"/>
-              <w:left w:type="dxa" w:w="70"/>
-              <w:bottom w:type="dxa" w:w="40"/>
-              <w:right w:type="dxa" w:w="70"/>
-            </w:tcMar>
-          </w:tcPr>
-          <w:p>
-            <w:pPr>
-              <w:spacing w:after="0" w:line="240"/>
-            </w:pPr>
-            <w:r>
-              <w:rPr>
-                <w:rFonts w:ascii="Calibri" w:cs="Calibri" w:eastAsia="Calibri" w:hAnsi="Calibri"/>
-                <w:sz w:val="16"/>
-                <w:szCs w:val="16"/>
-              </w:rPr>
-              <w:t xml:space="preserve">0</w:t>
             </w:r>
           </w:p>
         </w:tc>
@@ -21997,7 +21997,7 @@
                 <w:sz w:val="16"/>
                 <w:szCs w:val="16"/>
               </w:rPr>
-              <w:t xml:space="preserve">44</w:t>
+              <w:t xml:space="preserve">31</w:t>
             </w:r>
           </w:p>
         </w:tc>
@@ -22027,7 +22027,7 @@
                 <w:sz w:val="16"/>
                 <w:szCs w:val="16"/>
               </w:rPr>
-              <w:t xml:space="preserve">12</w:t>
+              <w:t xml:space="preserve">25</w:t>
             </w:r>
           </w:p>
         </w:tc>

</xml_diff>

<commit_message>
Add SCS4 audit review for run 20260924-7aed7be1; fix rename check
SCS4 (Sleephoria Cooling Sheets 4 Piece): review docx and per-row
workbook, judged on the Sellerboard planner for all 63 children.
Weekly sales fell 45% in three weeks, so the run's TACoS is priced on a
stale base; 31 King campaigns must leave King Graphite (15 days); the
Twin swaps onto Twin White (12 units) are held; one of four freezes is
a real loss.

The rename check read only SATIN SKUs, so the bamboo reviews held no
renames. It now reads every planner SKU. DBS4, DBS6 and DSS6 are
re-issued with the corrected rename rows. The method doc gains the
size-fix exception and the undated-inbound rule.

Co-Authored-By: Claude Opus 5.5 <noreply@anthropic.com>
Claude-Session: https://claude.ai/code/session_01ECNUyLvUafHehET6NevFNz
</commit_message>
<xml_diff>
--- a/docs/reviews/DBS4_Audit_Review_20260924-5e8a0f10.docx
+++ b/docs/reviews/DBS4_Audit_Review_20260924-5e8a0f10.docx
@@ -400,7 +400,7 @@
                 <w:sz w:val="16"/>
                 <w:szCs w:val="16"/>
               </w:rPr>
-              <w:t xml:space="preserve">26</w:t>
+              <w:t xml:space="preserve">27</w:t>
             </w:r>
           </w:p>
         </w:tc>
@@ -534,7 +534,7 @@
                 <w:sz w:val="16"/>
                 <w:szCs w:val="16"/>
               </w:rPr>
-              <w:t xml:space="preserve">206</w:t>
+              <w:t xml:space="preserve">205</w:t>
             </w:r>
           </w:p>
         </w:tc>
@@ -5554,7 +5554,7 @@
         <w:rPr>
           <w:rFonts w:ascii="Calibri" w:cs="Calibri" w:eastAsia="Calibri" w:hAnsi="Calibri"/>
         </w:rPr>
-        <w:t xml:space="preserve">The enabled campaigns advertise 25 children. 5 of them are out or under 14 days of stock: 9 campaigns, $59 of the $12,660 spent in the last 14 days. 1 more are at risk (flagged by the planner, under 30 days, or under 14 days of sellable FBA units, with no inbound to cover it): 47 campaigns, $1,797.</w:t>
+        <w:t xml:space="preserve">The enabled campaigns advertise 25 children. 5 of them are out or under 14 days of stock: 9 campaigns, $59 of the $12,660 spent in the last 14 days. 1 more is at risk (flagged by the planner, under 30 days, or under 14 days of sellable FBA units, with no inbound to cover it): 47 campaigns, $1,797.</w:t>
       </w:r>
     </w:p>
     <w:tbl>
@@ -21619,42 +21619,42 @@
                 <w:sz w:val="16"/>
                 <w:szCs w:val="16"/>
               </w:rPr>
+              <w:t xml:space="preserve">1</w:t>
+            </w:r>
+          </w:p>
+        </w:tc>
+        <w:tc>
+          <w:tcPr>
+            <w:tcW w:type="dxa" w:w="1700"/>
+            <w:tcBorders>
+              <w:top w:val="single" w:color="BFC7D1" w:sz="4"/>
+              <w:left w:val="single" w:color="BFC7D1" w:sz="4"/>
+              <w:bottom w:val="single" w:color="BFC7D1" w:sz="4"/>
+              <w:right w:val="single" w:color="BFC7D1" w:sz="4"/>
+            </w:tcBorders>
+            <w:tcMar>
+              <w:top w:type="dxa" w:w="40"/>
+              <w:left w:type="dxa" w:w="70"/>
+              <w:bottom w:type="dxa" w:w="40"/>
+              <w:right w:type="dxa" w:w="70"/>
+            </w:tcMar>
+          </w:tcPr>
+          <w:p>
+            <w:pPr>
+              <w:spacing w:after="0" w:line="240"/>
+            </w:pPr>
+            <w:r>
+              <w:rPr>
+                <w:rFonts w:ascii="Calibri" w:cs="Calibri" w:eastAsia="Calibri" w:hAnsi="Calibri"/>
+                <w:sz w:val="16"/>
+                <w:szCs w:val="16"/>
+              </w:rPr>
               <w:t xml:space="preserve">0</w:t>
             </w:r>
           </w:p>
         </w:tc>
         <w:tc>
           <w:tcPr>
-            <w:tcW w:type="dxa" w:w="1700"/>
-            <w:tcBorders>
-              <w:top w:val="single" w:color="BFC7D1" w:sz="4"/>
-              <w:left w:val="single" w:color="BFC7D1" w:sz="4"/>
-              <w:bottom w:val="single" w:color="BFC7D1" w:sz="4"/>
-              <w:right w:val="single" w:color="BFC7D1" w:sz="4"/>
-            </w:tcBorders>
-            <w:tcMar>
-              <w:top w:type="dxa" w:w="40"/>
-              <w:left w:type="dxa" w:w="70"/>
-              <w:bottom w:type="dxa" w:w="40"/>
-              <w:right w:type="dxa" w:w="70"/>
-            </w:tcMar>
-          </w:tcPr>
-          <w:p>
-            <w:pPr>
-              <w:spacing w:after="0" w:line="240"/>
-            </w:pPr>
-            <w:r>
-              <w:rPr>
-                <w:rFonts w:ascii="Calibri" w:cs="Calibri" w:eastAsia="Calibri" w:hAnsi="Calibri"/>
-                <w:sz w:val="16"/>
-                <w:szCs w:val="16"/>
-              </w:rPr>
-              <w:t xml:space="preserve">0</w:t>
-            </w:r>
-          </w:p>
-        </w:tc>
-        <w:tc>
-          <w:tcPr>
             <w:tcW w:type="dxa" w:w="1472"/>
             <w:tcBorders>
               <w:top w:val="single" w:color="BFC7D1" w:sz="4"/>
@@ -21679,7 +21679,7 @@
                 <w:sz w:val="16"/>
                 <w:szCs w:val="16"/>
               </w:rPr>
-              <w:t xml:space="preserve">0</w:t>
+              <w:t xml:space="preserve">2</w:t>
             </w:r>
           </w:p>
         </w:tc>
@@ -21997,7 +21997,7 @@
                 <w:sz w:val="16"/>
                 <w:szCs w:val="16"/>
               </w:rPr>
-              <w:t xml:space="preserve">31</w:t>
+              <w:t xml:space="preserve">32</w:t>
             </w:r>
           </w:p>
         </w:tc>

</xml_diff>